<commit_message>
implement data cleaning and processing such as data imputation
</commit_message>
<xml_diff>
--- a/Documents/Predictive-Modeling-of-Early-Stage-Chronic-Kidney-Disease-Using-Explainable-AI.docx
+++ b/Documents/Predictive-Modeling-of-Early-Stage-Chronic-Kidney-Disease-Using-Explainable-AI.docx
@@ -8,13 +8,17 @@
           <w:rFonts w:ascii="Times New Roman" w:hAnsi="Times New Roman" w:cs="Times New Roman"/>
           <w:b/>
           <w:bCs/>
-        </w:rPr>
-      </w:pPr>
-      <w:r>
-        <w:rPr>
-          <w:rFonts w:ascii="Times New Roman" w:hAnsi="Times New Roman" w:cs="Times New Roman"/>
-          <w:b/>
-          <w:bCs/>
+          <w:sz w:val="40"/>
+          <w:szCs w:val="44"/>
+        </w:rPr>
+      </w:pPr>
+      <w:r>
+        <w:rPr>
+          <w:rFonts w:ascii="Times New Roman" w:hAnsi="Times New Roman" w:cs="Times New Roman"/>
+          <w:b/>
+          <w:bCs/>
+          <w:sz w:val="40"/>
+          <w:szCs w:val="44"/>
         </w:rPr>
         <w:t>Phase 1: Problem Understanding and Literature Review</w:t>
       </w:r>
@@ -617,14 +621,14 @@
         <w:rPr>
           <w:rFonts w:ascii="Times New Roman" w:hAnsi="Times New Roman" w:cs="Times New Roman"/>
         </w:rPr>
-        <w:t xml:space="preserve"> "Chronic Kidney Disease often progresses undetected in resource-constrained regions due to a lack of early screening. This project aims to develop an interpretable binary classification model capable of predicting early-stage CKD using routine clinical test data. By addressing the challenge of missing clinical data through advanced </w:t>
+        <w:t xml:space="preserve"> "Chronic Kidney Disease often progresses undetected in resource-constrained regions due to a lack of early screening. This project aims to develop an </w:t>
       </w:r>
       <w:r>
         <w:rPr>
           <w:rFonts w:ascii="Times New Roman" w:hAnsi="Times New Roman" w:cs="Times New Roman"/>
         </w:rPr>
         <w:lastRenderedPageBreak/>
-        <w:t>imputation and employing Explainable AI techniques, this work provides a reliable, transparent screening tool suitable for integration into telehealth applications."</w:t>
+        <w:t>interpretable binary classification model capable of predicting early-stage CKD using routine clinical test data. By addressing the challenge of missing clinical data through advanced imputation and employing Explainable AI techniques, this work provides a reliable, transparent screening tool suitable for integration into telehealth applications."</w:t>
       </w:r>
     </w:p>
     <w:p>
@@ -706,12 +710,16 @@
         <w:rPr>
           <w:b/>
           <w:bCs/>
-        </w:rPr>
-      </w:pPr>
-      <w:r>
-        <w:rPr>
-          <w:b/>
-          <w:bCs/>
+          <w:sz w:val="40"/>
+          <w:szCs w:val="44"/>
+        </w:rPr>
+      </w:pPr>
+      <w:r>
+        <w:rPr>
+          <w:b/>
+          <w:bCs/>
+          <w:sz w:val="40"/>
+          <w:szCs w:val="44"/>
         </w:rPr>
         <w:t>Phase 2: Dataset Collection and Exploratory Data Analysis (EDA)</w:t>
       </w:r>
@@ -899,6 +907,7 @@
     </w:p>
     <w:p>
       <w:r>
+        <w:lastRenderedPageBreak/>
         <w:t xml:space="preserve"># The UCI dataset often represents missing values with '?'. </w:t>
       </w:r>
     </w:p>
@@ -909,7 +918,6 @@
     </w:p>
     <w:p>
       <w:r>
-        <w:lastRenderedPageBreak/>
         <w:t>url = "https://raw.githubusercontent.com/jbrownlee/Datasets/master/chronic_kidney_disease.csv"</w:t>
       </w:r>
     </w:p>
@@ -1097,7 +1105,6 @@
     </w:p>
     <w:p>
       <w:r>
-        <w:lastRenderedPageBreak/>
         <w:t># High correlation between features can cause multicollinearity issues later.</w:t>
       </w:r>
     </w:p>
@@ -1376,6 +1383,639 @@
         <w:t>Run the code in your Jupyter environment, look at the plots, and review the missing values. Let me know when you have successfully executed the EDA and are ready to tackle the messiest part of the project: Data Cleaning.</w:t>
       </w:r>
     </w:p>
+    <w:p/>
+    <w:p/>
+    <w:p>
+      <w:r>
+        <w:t>This is where the real engineering happens. In the industry, data scientists spend about 70% of their time on data cleaning.</w:t>
+      </w:r>
+    </w:p>
+    <w:p>
+      <w:r>
+        <w:t xml:space="preserve">If you looked closely at the df.info() output from Phase 2, you might have noticed a major problem: columns like packed_cell_volume and white_blood_cell_count were listed as </w:t>
+      </w:r>
+      <w:r>
+        <w:lastRenderedPageBreak/>
+        <w:t>object (text) types, even though they should be numbers. This happens because the raw dataset contains hidden typos like \t43 or \tyes.</w:t>
+      </w:r>
+    </w:p>
+    <w:p>
+      <w:r>
+        <w:t>Let's clean this up scientifically.</w:t>
+      </w:r>
+    </w:p>
+    <w:p>
+      <w:pPr>
+        <w:rPr>
+          <w:b/>
+          <w:bCs/>
+          <w:sz w:val="44"/>
+          <w:szCs w:val="48"/>
+        </w:rPr>
+      </w:pPr>
+      <w:r>
+        <w:rPr>
+          <w:b/>
+          <w:bCs/>
+          <w:sz w:val="44"/>
+          <w:szCs w:val="48"/>
+        </w:rPr>
+        <w:t>Phase 3: Data Cleaning and Preprocessing</w:t>
+      </w:r>
+    </w:p>
+    <w:p>
+      <w:pPr>
+        <w:rPr>
+          <w:b/>
+          <w:bCs/>
+        </w:rPr>
+      </w:pPr>
+      <w:r>
+        <w:rPr>
+          <w:b/>
+          <w:bCs/>
+        </w:rPr>
+        <w:t>Objective</w:t>
+      </w:r>
+    </w:p>
+    <w:p>
+      <w:r>
+        <w:t>To resolve incorrect data types, remove hidden typos, encode text into machine-readable numbers, and intelligently impute (fill in) missing values without distorting the clinical reality.</w:t>
+      </w:r>
+    </w:p>
+    <w:p>
+      <w:pPr>
+        <w:rPr>
+          <w:b/>
+          <w:bCs/>
+        </w:rPr>
+      </w:pPr>
+      <w:r>
+        <w:rPr>
+          <w:b/>
+          <w:bCs/>
+        </w:rPr>
+        <w:t>Theory</w:t>
+      </w:r>
+    </w:p>
+    <w:p>
+      <w:pPr>
+        <w:numPr>
+          <w:ilvl w:val="0"/>
+          <w:numId w:val="9"/>
+        </w:numPr>
+      </w:pPr>
+      <w:r>
+        <w:rPr>
+          <w:b/>
+          <w:bCs/>
+        </w:rPr>
+        <w:t>Imputation vs. Dropping:</w:t>
+      </w:r>
+      <w:r>
+        <w:t xml:space="preserve"> If we drop every row that has a missing value, we will lose almost half our dataset. Instead, we </w:t>
+      </w:r>
+      <w:r>
+        <w:rPr>
+          <w:b/>
+          <w:bCs/>
+        </w:rPr>
+        <w:t>impute</w:t>
+      </w:r>
+      <w:r>
+        <w:t xml:space="preserve"> (guess the missing value based on math).</w:t>
+      </w:r>
+    </w:p>
+    <w:p>
+      <w:pPr>
+        <w:numPr>
+          <w:ilvl w:val="0"/>
+          <w:numId w:val="9"/>
+        </w:numPr>
+      </w:pPr>
+      <w:r>
+        <w:rPr>
+          <w:b/>
+          <w:bCs/>
+        </w:rPr>
+        <w:t>Mode Imputation (Categorical):</w:t>
+      </w:r>
+      <w:r>
+        <w:t xml:space="preserve"> For missing text categories (like whether a patient has hypertension), we fill in the most common answer (the mode).</w:t>
+      </w:r>
+    </w:p>
+    <w:p>
+      <w:pPr>
+        <w:numPr>
+          <w:ilvl w:val="0"/>
+          <w:numId w:val="9"/>
+        </w:numPr>
+      </w:pPr>
+      <w:r>
+        <w:rPr>
+          <w:b/>
+          <w:bCs/>
+        </w:rPr>
+        <w:t>KNN Imputation (Numerical):</w:t>
+      </w:r>
+      <w:r>
+        <w:t xml:space="preserve"> Instead of just filling missing blood pressure with the average blood pressure of </w:t>
+      </w:r>
+      <w:r>
+        <w:rPr>
+          <w:i/>
+          <w:iCs/>
+        </w:rPr>
+        <w:t>everyone</w:t>
+      </w:r>
+      <w:r>
+        <w:t xml:space="preserve">, we use </w:t>
+      </w:r>
+      <w:r>
+        <w:rPr>
+          <w:b/>
+          <w:bCs/>
+        </w:rPr>
+        <w:t>K-Nearest Neighbors (KNN)</w:t>
+      </w:r>
+      <w:r>
+        <w:t xml:space="preserve">. It looks for 5 patients who have similar profiles to our patient and takes the average of </w:t>
+      </w:r>
+      <w:r>
+        <w:rPr>
+          <w:i/>
+          <w:iCs/>
+        </w:rPr>
+        <w:t>their</w:t>
+      </w:r>
+      <w:r>
+        <w:t xml:space="preserve"> blood pressure. This is a highly publishable, research-grade approach.</w:t>
+      </w:r>
+    </w:p>
+    <w:p>
+      <w:pPr>
+        <w:rPr>
+          <w:b/>
+          <w:bCs/>
+        </w:rPr>
+      </w:pPr>
+      <w:r>
+        <w:rPr>
+          <w:b/>
+          <w:bCs/>
+        </w:rPr>
+        <w:t>Why It Is Important</w:t>
+      </w:r>
+    </w:p>
+    <w:p>
+      <w:r>
+        <w:t>Standard machine learning models (like Logistic Regression or SVM) cannot handle empty cells (NaN) or text ("yes", "abnormal"). The data must be a perfectly clean grid of numbers before training.</w:t>
+      </w:r>
+    </w:p>
+    <w:p>
+      <w:pPr>
+        <w:rPr>
+          <w:b/>
+          <w:bCs/>
+        </w:rPr>
+      </w:pPr>
+      <w:r>
+        <w:rPr>
+          <w:b/>
+          <w:bCs/>
+        </w:rPr>
+        <w:t>Implementation: Python Code</w:t>
+      </w:r>
+    </w:p>
+    <w:p>
+      <w:r>
+        <w:t>Add this code in a new cell in your Jupyter Notebook, right below the Phase 2 code.</w:t>
+      </w:r>
+    </w:p>
+    <w:p>
+      <w:r>
+        <w:t>Python</w:t>
+      </w:r>
+    </w:p>
+    <w:p>
+      <w:r>
+        <w:t>from sklearn.impute import KNNImputer</w:t>
+      </w:r>
+    </w:p>
+    <w:p>
+      <w:r>
+        <w:t>from sklearn.preprocessing import LabelEncoder</w:t>
+      </w:r>
+    </w:p>
+    <w:p/>
+    <w:p>
+      <w:r>
+        <w:t>print("Starting Data Cleaning...")</w:t>
+      </w:r>
+    </w:p>
+    <w:p/>
+    <w:p>
+      <w:r>
+        <w:t># 1. Clean invisible typos (tabs and spaces) in categorical columns</w:t>
+      </w:r>
+    </w:p>
+    <w:p>
+      <w:r>
+        <w:t># The dataset has hidden strings like '\tyes', ' yes', or '\tno'</w:t>
+      </w:r>
+    </w:p>
+    <w:p>
+      <w:r>
+        <w:t>categorical_cols = df.select_dtypes(include=['object']).columns</w:t>
+      </w:r>
+    </w:p>
+    <w:p/>
+    <w:p>
+      <w:r>
+        <w:t>for col in categorical_cols:</w:t>
+      </w:r>
+    </w:p>
+    <w:p>
+      <w:r>
+        <w:t xml:space="preserve">    # Convert to string, strip whitespace and tabs, then replace 'nan' back to actual np.nan</w:t>
+      </w:r>
+    </w:p>
+    <w:p>
+      <w:r>
+        <w:t xml:space="preserve">    df[col] = df[col].astype(str).str.strip()</w:t>
+      </w:r>
+    </w:p>
+    <w:p>
+      <w:r>
+        <w:t xml:space="preserve">    df[col] = df[col].replace('nan', np.nan)</w:t>
+      </w:r>
+    </w:p>
+    <w:p/>
+    <w:p>
+      <w:r>
+        <w:t># 2. Fix Incorrect Data Types</w:t>
+      </w:r>
+    </w:p>
+    <w:p>
+      <w:r>
+        <w:t># These columns are numerical but got parsed as objects due to typos in the raw file</w:t>
+      </w:r>
+    </w:p>
+    <w:p>
+      <w:r>
+        <w:t>cols_to_numeric = ['packed_cell_volume', 'white_blood_cell_count', 'red_blood_cell_count']</w:t>
+      </w:r>
+    </w:p>
+    <w:p>
+      <w:r>
+        <w:t>for col in cols_to_numeric:</w:t>
+      </w:r>
+    </w:p>
+    <w:p>
+      <w:r>
+        <w:t xml:space="preserve">    # errors='coerce' forces any unreadable text (like '?') to become NaN</w:t>
+      </w:r>
+    </w:p>
+    <w:p>
+      <w:r>
+        <w:t xml:space="preserve">    df[col] = pd.to_numeric(df[col], errors='coerce')</w:t>
+      </w:r>
+    </w:p>
+    <w:p/>
+    <w:p>
+      <w:r>
+        <w:t># 3. Handle Missing Values (Imputation)</w:t>
+      </w:r>
+    </w:p>
+    <w:p>
+      <w:r>
+        <w:lastRenderedPageBreak/>
+        <w:t># Update our lists of categorical and numerical columns after the dtype fix</w:t>
+      </w:r>
+    </w:p>
+    <w:p>
+      <w:r>
+        <w:t>categorical_cols = df.select_dtypes(include=['object']).columns</w:t>
+      </w:r>
+    </w:p>
+    <w:p>
+      <w:r>
+        <w:t>numerical_cols = df.select_dtypes(include=['float64', 'int64']).columns</w:t>
+      </w:r>
+    </w:p>
+    <w:p/>
+    <w:p>
+      <w:r>
+        <w:t># Do NOT impute the target variable! Drop it from the numerical list temporarily.</w:t>
+      </w:r>
+    </w:p>
+    <w:p>
+      <w:r>
+        <w:t>if 'target' in numerical_cols:</w:t>
+      </w:r>
+    </w:p>
+    <w:p>
+      <w:r>
+        <w:t xml:space="preserve">    numerical_cols = numerical_cols.drop('target')</w:t>
+      </w:r>
+    </w:p>
+    <w:p/>
+    <w:p>
+      <w:r>
+        <w:t># A. Categorical Imputation: Fill missing with Mode (most frequent value)</w:t>
+      </w:r>
+    </w:p>
+    <w:p>
+      <w:r>
+        <w:t>for col in categorical_cols:</w:t>
+      </w:r>
+    </w:p>
+    <w:p>
+      <w:r>
+        <w:t xml:space="preserve">    df[col] = df[col].fillna(df[col].mode()[0])</w:t>
+      </w:r>
+    </w:p>
+    <w:p/>
+    <w:p>
+      <w:r>
+        <w:t># B. Numerical Imputation: Use KNN Imputer (Research-level)</w:t>
+      </w:r>
+    </w:p>
+    <w:p>
+      <w:r>
+        <w:t>print("Applying KNN Imputation for numerical features...")</w:t>
+      </w:r>
+    </w:p>
+    <w:p>
+      <w:r>
+        <w:t>knn_imputer = KNNImputer(n_neighbors=5)</w:t>
+      </w:r>
+    </w:p>
+    <w:p>
+      <w:r>
+        <w:t>df[numerical_cols] = knn_imputer.fit_transform(df[numerical_cols])</w:t>
+      </w:r>
+    </w:p>
+    <w:p/>
+    <w:p>
+      <w:r>
+        <w:t># 4. Encode Categorical Variables (Label Encoding)</w:t>
+      </w:r>
+    </w:p>
+    <w:p>
+      <w:r>
+        <w:t># Machine Learning models need numbers, not text like 'normal' or 'abnormal'</w:t>
+      </w:r>
+    </w:p>
+    <w:p>
+      <w:r>
+        <w:t>label_encoders = {}</w:t>
+      </w:r>
+    </w:p>
+    <w:p>
+      <w:r>
+        <w:t>for col in categorical_cols:</w:t>
+      </w:r>
+    </w:p>
+    <w:p>
+      <w:r>
+        <w:t xml:space="preserve">    le = LabelEncoder()</w:t>
+      </w:r>
+    </w:p>
+    <w:p>
+      <w:r>
+        <w:t xml:space="preserve">    df[col] = le.fit_transform(df[col])</w:t>
+      </w:r>
+    </w:p>
+    <w:p>
+      <w:r>
+        <w:t xml:space="preserve">    label_encoders[col] = le # We save the encoder for deployment later!</w:t>
+      </w:r>
+    </w:p>
+    <w:p/>
+    <w:p>
+      <w:r>
+        <w:t># 5. Final Sanity Check</w:t>
+      </w:r>
+    </w:p>
+    <w:p>
+      <w:r>
+        <w:t>print("\n--- Data Types After Cleaning ---")</w:t>
+      </w:r>
+    </w:p>
+    <w:p>
+      <w:r>
+        <w:t>print(df.info())</w:t>
+      </w:r>
+    </w:p>
+    <w:p>
+      <w:r>
+        <w:t>print("\n--- Total Missing Values After Cleaning ---")</w:t>
+      </w:r>
+    </w:p>
+    <w:p>
+      <w:r>
+        <w:t>print(df.isnull().sum().sum()) # Should print 0</w:t>
+      </w:r>
+    </w:p>
+    <w:p>
+      <w:pPr>
+        <w:rPr>
+          <w:b/>
+          <w:bCs/>
+        </w:rPr>
+      </w:pPr>
+      <w:r>
+        <w:rPr>
+          <w:b/>
+          <w:bCs/>
+        </w:rPr>
+        <w:t>Best Practices</w:t>
+      </w:r>
+    </w:p>
+    <w:p>
+      <w:pPr>
+        <w:numPr>
+          <w:ilvl w:val="0"/>
+          <w:numId w:val="10"/>
+        </w:numPr>
+      </w:pPr>
+      <w:r>
+        <w:rPr>
+          <w:b/>
+          <w:bCs/>
+        </w:rPr>
+        <w:t>Save your Encoders:</w:t>
+      </w:r>
+      <w:r>
+        <w:t xml:space="preserve"> Notice how I saved the LabelEncoder in a dictionary (label_encoders[col] = le). When you deploy this as a web app later, a user will input "yes" for diabetes, and you will need this saved encoder to translate it back to the exact number the model expects.</w:t>
+      </w:r>
+    </w:p>
+    <w:p>
+      <w:pPr>
+        <w:numPr>
+          <w:ilvl w:val="0"/>
+          <w:numId w:val="10"/>
+        </w:numPr>
+      </w:pPr>
+      <w:r>
+        <w:rPr>
+          <w:b/>
+          <w:bCs/>
+        </w:rPr>
+        <w:t>Never Impute the Target:</w:t>
+      </w:r>
+      <w:r>
+        <w:t xml:space="preserve"> We explicitly removed target from the imputation list. You never guess a patient's diagnosis—if the diagnosis is missing, you drop the row (luckily, our dataset has all targets).</w:t>
+      </w:r>
+    </w:p>
+    <w:p>
+      <w:pPr>
+        <w:rPr>
+          <w:b/>
+          <w:bCs/>
+        </w:rPr>
+      </w:pPr>
+      <w:r>
+        <w:rPr>
+          <w:b/>
+          <w:bCs/>
+        </w:rPr>
+        <w:t>Common Mistakes</w:t>
+      </w:r>
+    </w:p>
+    <w:p>
+      <w:pPr>
+        <w:numPr>
+          <w:ilvl w:val="0"/>
+          <w:numId w:val="11"/>
+        </w:numPr>
+      </w:pPr>
+      <w:r>
+        <w:rPr>
+          <w:b/>
+          <w:bCs/>
+        </w:rPr>
+        <w:t>Data Leakage:</w:t>
+      </w:r>
+      <w:r>
+        <w:t xml:space="preserve"> Using simple Mean Imputation can sometimes introduce bias. KNN is safer for medical data because it relies on patient similarity.</w:t>
+      </w:r>
+    </w:p>
+    <w:p>
+      <w:pPr>
+        <w:numPr>
+          <w:ilvl w:val="0"/>
+          <w:numId w:val="11"/>
+        </w:numPr>
+      </w:pPr>
+      <w:r>
+        <w:rPr>
+          <w:b/>
+          <w:bCs/>
+        </w:rPr>
+        <w:t xml:space="preserve">Missing </w:t>
+      </w:r>
+      <w:r>
+        <w:t>.astype(str)</w:t>
+      </w:r>
+      <w:r>
+        <w:rPr>
+          <w:b/>
+          <w:bCs/>
+        </w:rPr>
+        <w:t xml:space="preserve"> before stripping:</w:t>
+      </w:r>
+      <w:r>
+        <w:t xml:space="preserve"> If you try to run .str.strip() on a column that already has NaN (float) values, Python throws an error.</w:t>
+      </w:r>
+    </w:p>
+    <w:p>
+      <w:pPr>
+        <w:rPr>
+          <w:b/>
+          <w:bCs/>
+        </w:rPr>
+      </w:pPr>
+      <w:r>
+        <w:rPr>
+          <w:b/>
+          <w:bCs/>
+        </w:rPr>
+        <w:t>Expected Output</w:t>
+      </w:r>
+    </w:p>
+    <w:p>
+      <w:r>
+        <w:t>When you run this, df.info() will show 400 entries, completely non-null, and every single column will be an int64 or float64. The final missing value count will be strictly 0.</w:t>
+      </w:r>
+    </w:p>
+    <w:p>
+      <w:pPr>
+        <w:rPr>
+          <w:b/>
+          <w:bCs/>
+        </w:rPr>
+      </w:pPr>
+      <w:r>
+        <w:rPr>
+          <w:b/>
+          <w:bCs/>
+        </w:rPr>
+        <w:t>How to Explain It During Viva</w:t>
+      </w:r>
+    </w:p>
+    <w:p>
+      <w:r>
+        <w:rPr>
+          <w:b/>
+          <w:bCs/>
+        </w:rPr>
+        <w:lastRenderedPageBreak/>
+        <w:t>Examiner:</w:t>
+      </w:r>
+      <w:r>
+        <w:t xml:space="preserve"> "Why did you use KNN Imputer instead of just taking the average (mean) of the column to fill missing values?"</w:t>
+      </w:r>
+    </w:p>
+    <w:p>
+      <w:r>
+        <w:rPr>
+          <w:b/>
+          <w:bCs/>
+        </w:rPr>
+        <w:t>Your Answer:</w:t>
+      </w:r>
+      <w:r>
+        <w:t xml:space="preserve"> "Clinical data is highly individualized. If a patient is missing their hemoglobin level, filling it with the global average ignores their other health conditions. KNN Imputer calculates the multidimensional distance between patients. It finds 5 patients with very similar blood pressure, sugar, and age profiles, and averages </w:t>
+      </w:r>
+      <w:r>
+        <w:rPr>
+          <w:i/>
+          <w:iCs/>
+        </w:rPr>
+        <w:t>their</w:t>
+      </w:r>
+      <w:r>
+        <w:t xml:space="preserve"> hemoglobin. This preserves the underlying clinical variance and results in a much more accurate predictive model."</w:t>
+      </w:r>
+    </w:p>
+    <w:p>
+      <w:r>
+        <w:t xml:space="preserve">Run the code block. Once you confirm the dataset is 100% clean and numeric, we will move to </w:t>
+      </w:r>
+      <w:r>
+        <w:rPr>
+          <w:b/>
+          <w:bCs/>
+        </w:rPr>
+        <w:t>Phase 4: Feature Selection and Data Splitting</w:t>
+      </w:r>
+      <w:r>
+        <w:t>, where we separate the signal from the noise.</w:t>
+      </w:r>
+    </w:p>
+    <w:p/>
     <w:p/>
     <w:p/>
     <w:p/>
@@ -1395,6 +2035,155 @@
 <file path=word/numbering.xml><?xml version="1.0" encoding="utf-8"?>
 <w:numbering xmlns:wpc="http://schemas.microsoft.com/office/word/2010/wordprocessingCanvas" xmlns:cx="http://schemas.microsoft.com/office/drawing/2014/chartex" xmlns:cx1="http://schemas.microsoft.com/office/drawing/2015/9/8/chartex" xmlns:cx2="http://schemas.microsoft.com/office/drawing/2015/10/21/chartex" xmlns:cx3="http://schemas.microsoft.com/office/drawing/2016/5/9/chartex" xmlns:cx4="http://schemas.microsoft.com/office/drawing/2016/5/10/chartex" xmlns:cx5="http://schemas.microsoft.com/office/drawing/2016/5/11/chartex" xmlns:cx6="http://schemas.microsoft.com/office/drawing/2016/5/12/chartex" xmlns:cx7="http://schemas.microsoft.com/office/drawing/2016/5/13/chartex" xmlns:cx8="http://schemas.microsoft.com/office/drawing/2016/5/14/chartex" xmlns:mc="http://schemas.openxmlformats.org/markup-compatibility/2006" xmlns:aink="http://schemas.microsoft.com/office/drawing/2016/ink" xmlns:am3d="http://schemas.microsoft.com/office/drawing/2017/model3d" xmlns:o="urn:schemas-microsoft-com:office:office" xmlns:oel="http://schemas.microsoft.com/office/2019/extlst" xmlns:r="http://schemas.openxmlformats.org/officeDocument/2006/relationships" xmlns:m="http://schemas.openxmlformats.org/officeDocument/2006/math" xmlns:v="urn:schemas-microsoft-com:vml" xmlns:wp14="http://schemas.microsoft.com/office/word/2010/wordprocessingDrawing" xmlns:wp="http://schemas.openxmlformats.org/drawingml/2006/wordprocessingDrawing" xmlns:w10="urn:schemas-microsoft-com:office:word" xmlns:w="http://schemas.openxmlformats.org/wordprocessingml/2006/main" xmlns:w14="http://schemas.microsoft.com/office/word/2010/wordml" xmlns:w15="http://schemas.microsoft.com/office/word/2012/wordml" xmlns:w16cex="http://schemas.microsoft.com/office/word/2018/wordml/cex" xmlns:w16cid="http://schemas.microsoft.com/office/word/2016/wordml/cid" xmlns:w16="http://schemas.microsoft.com/office/word/2018/wordml" xmlns:w16sdtdh="http://schemas.microsoft.com/office/word/2020/wordml/sdtdatahash" xmlns:w16se="http://schemas.microsoft.com/office/word/2015/wordml/symex" xmlns:wpg="http://schemas.microsoft.com/office/word/2010/wordprocessingGroup" xmlns:wpi="http://schemas.microsoft.com/office/word/2010/wordprocessingInk" xmlns:wne="http://schemas.microsoft.com/office/word/2006/wordml" xmlns:wps="http://schemas.microsoft.com/office/word/2010/wordprocessingShape" mc:Ignorable="w14 w15 w16se w16cid w16 w16cex w16sdtdh wp14">
   <w:abstractNum w:abstractNumId="0" w15:restartNumberingAfterBreak="0">
+    <w:nsid w:val="05C506AC"/>
+    <w:multiLevelType w:val="multilevel"/>
+    <w:tmpl w:val="51BE7122"/>
+    <w:lvl w:ilvl="0">
+      <w:start w:val="1"/>
+      <w:numFmt w:val="bullet"/>
+      <w:lvlText w:val=""/>
+      <w:lvlJc w:val="left"/>
+      <w:pPr>
+        <w:tabs>
+          <w:tab w:val="num" w:pos="720"/>
+        </w:tabs>
+        <w:ind w:left="720" w:hanging="360"/>
+      </w:pPr>
+      <w:rPr>
+        <w:rFonts w:ascii="Symbol" w:hAnsi="Symbol" w:hint="default"/>
+        <w:sz w:val="20"/>
+      </w:rPr>
+    </w:lvl>
+    <w:lvl w:ilvl="1" w:tentative="1">
+      <w:start w:val="1"/>
+      <w:numFmt w:val="bullet"/>
+      <w:lvlText w:val="o"/>
+      <w:lvlJc w:val="left"/>
+      <w:pPr>
+        <w:tabs>
+          <w:tab w:val="num" w:pos="1440"/>
+        </w:tabs>
+        <w:ind w:left="1440" w:hanging="360"/>
+      </w:pPr>
+      <w:rPr>
+        <w:rFonts w:ascii="Courier New" w:hAnsi="Courier New" w:hint="default"/>
+        <w:sz w:val="20"/>
+      </w:rPr>
+    </w:lvl>
+    <w:lvl w:ilvl="2" w:tentative="1">
+      <w:start w:val="1"/>
+      <w:numFmt w:val="bullet"/>
+      <w:lvlText w:val=""/>
+      <w:lvlJc w:val="left"/>
+      <w:pPr>
+        <w:tabs>
+          <w:tab w:val="num" w:pos="2160"/>
+        </w:tabs>
+        <w:ind w:left="2160" w:hanging="360"/>
+      </w:pPr>
+      <w:rPr>
+        <w:rFonts w:ascii="Wingdings" w:hAnsi="Wingdings" w:hint="default"/>
+        <w:sz w:val="20"/>
+      </w:rPr>
+    </w:lvl>
+    <w:lvl w:ilvl="3" w:tentative="1">
+      <w:start w:val="1"/>
+      <w:numFmt w:val="bullet"/>
+      <w:lvlText w:val=""/>
+      <w:lvlJc w:val="left"/>
+      <w:pPr>
+        <w:tabs>
+          <w:tab w:val="num" w:pos="2880"/>
+        </w:tabs>
+        <w:ind w:left="2880" w:hanging="360"/>
+      </w:pPr>
+      <w:rPr>
+        <w:rFonts w:ascii="Wingdings" w:hAnsi="Wingdings" w:hint="default"/>
+        <w:sz w:val="20"/>
+      </w:rPr>
+    </w:lvl>
+    <w:lvl w:ilvl="4" w:tentative="1">
+      <w:start w:val="1"/>
+      <w:numFmt w:val="bullet"/>
+      <w:lvlText w:val=""/>
+      <w:lvlJc w:val="left"/>
+      <w:pPr>
+        <w:tabs>
+          <w:tab w:val="num" w:pos="3600"/>
+        </w:tabs>
+        <w:ind w:left="3600" w:hanging="360"/>
+      </w:pPr>
+      <w:rPr>
+        <w:rFonts w:ascii="Wingdings" w:hAnsi="Wingdings" w:hint="default"/>
+        <w:sz w:val="20"/>
+      </w:rPr>
+    </w:lvl>
+    <w:lvl w:ilvl="5" w:tentative="1">
+      <w:start w:val="1"/>
+      <w:numFmt w:val="bullet"/>
+      <w:lvlText w:val=""/>
+      <w:lvlJc w:val="left"/>
+      <w:pPr>
+        <w:tabs>
+          <w:tab w:val="num" w:pos="4320"/>
+        </w:tabs>
+        <w:ind w:left="4320" w:hanging="360"/>
+      </w:pPr>
+      <w:rPr>
+        <w:rFonts w:ascii="Wingdings" w:hAnsi="Wingdings" w:hint="default"/>
+        <w:sz w:val="20"/>
+      </w:rPr>
+    </w:lvl>
+    <w:lvl w:ilvl="6" w:tentative="1">
+      <w:start w:val="1"/>
+      <w:numFmt w:val="bullet"/>
+      <w:lvlText w:val=""/>
+      <w:lvlJc w:val="left"/>
+      <w:pPr>
+        <w:tabs>
+          <w:tab w:val="num" w:pos="5040"/>
+        </w:tabs>
+        <w:ind w:left="5040" w:hanging="360"/>
+      </w:pPr>
+      <w:rPr>
+        <w:rFonts w:ascii="Wingdings" w:hAnsi="Wingdings" w:hint="default"/>
+        <w:sz w:val="20"/>
+      </w:rPr>
+    </w:lvl>
+    <w:lvl w:ilvl="7" w:tentative="1">
+      <w:start w:val="1"/>
+      <w:numFmt w:val="bullet"/>
+      <w:lvlText w:val=""/>
+      <w:lvlJc w:val="left"/>
+      <w:pPr>
+        <w:tabs>
+          <w:tab w:val="num" w:pos="5760"/>
+        </w:tabs>
+        <w:ind w:left="5760" w:hanging="360"/>
+      </w:pPr>
+      <w:rPr>
+        <w:rFonts w:ascii="Wingdings" w:hAnsi="Wingdings" w:hint="default"/>
+        <w:sz w:val="20"/>
+      </w:rPr>
+    </w:lvl>
+    <w:lvl w:ilvl="8" w:tentative="1">
+      <w:start w:val="1"/>
+      <w:numFmt w:val="bullet"/>
+      <w:lvlText w:val=""/>
+      <w:lvlJc w:val="left"/>
+      <w:pPr>
+        <w:tabs>
+          <w:tab w:val="num" w:pos="6480"/>
+        </w:tabs>
+        <w:ind w:left="6480" w:hanging="360"/>
+      </w:pPr>
+      <w:rPr>
+        <w:rFonts w:ascii="Wingdings" w:hAnsi="Wingdings" w:hint="default"/>
+        <w:sz w:val="20"/>
+      </w:rPr>
+    </w:lvl>
+  </w:abstractNum>
+  <w:abstractNum w:abstractNumId="1" w15:restartNumberingAfterBreak="0">
     <w:nsid w:val="10D03B3C"/>
     <w:multiLevelType w:val="multilevel"/>
     <w:tmpl w:val="41327AF0"/>
@@ -1543,7 +2332,7 @@
       </w:rPr>
     </w:lvl>
   </w:abstractNum>
-  <w:abstractNum w:abstractNumId="1" w15:restartNumberingAfterBreak="0">
+  <w:abstractNum w:abstractNumId="2" w15:restartNumberingAfterBreak="0">
     <w:nsid w:val="1158174A"/>
     <w:multiLevelType w:val="multilevel"/>
     <w:tmpl w:val="3918D5BC"/>
@@ -1692,7 +2481,156 @@
       </w:rPr>
     </w:lvl>
   </w:abstractNum>
-  <w:abstractNum w:abstractNumId="2" w15:restartNumberingAfterBreak="0">
+  <w:abstractNum w:abstractNumId="3" w15:restartNumberingAfterBreak="0">
+    <w:nsid w:val="1FB22257"/>
+    <w:multiLevelType w:val="multilevel"/>
+    <w:tmpl w:val="5C5CBA8A"/>
+    <w:lvl w:ilvl="0">
+      <w:start w:val="1"/>
+      <w:numFmt w:val="bullet"/>
+      <w:lvlText w:val=""/>
+      <w:lvlJc w:val="left"/>
+      <w:pPr>
+        <w:tabs>
+          <w:tab w:val="num" w:pos="720"/>
+        </w:tabs>
+        <w:ind w:left="720" w:hanging="360"/>
+      </w:pPr>
+      <w:rPr>
+        <w:rFonts w:ascii="Symbol" w:hAnsi="Symbol" w:hint="default"/>
+        <w:sz w:val="20"/>
+      </w:rPr>
+    </w:lvl>
+    <w:lvl w:ilvl="1" w:tentative="1">
+      <w:start w:val="1"/>
+      <w:numFmt w:val="bullet"/>
+      <w:lvlText w:val="o"/>
+      <w:lvlJc w:val="left"/>
+      <w:pPr>
+        <w:tabs>
+          <w:tab w:val="num" w:pos="1440"/>
+        </w:tabs>
+        <w:ind w:left="1440" w:hanging="360"/>
+      </w:pPr>
+      <w:rPr>
+        <w:rFonts w:ascii="Courier New" w:hAnsi="Courier New" w:hint="default"/>
+        <w:sz w:val="20"/>
+      </w:rPr>
+    </w:lvl>
+    <w:lvl w:ilvl="2" w:tentative="1">
+      <w:start w:val="1"/>
+      <w:numFmt w:val="bullet"/>
+      <w:lvlText w:val=""/>
+      <w:lvlJc w:val="left"/>
+      <w:pPr>
+        <w:tabs>
+          <w:tab w:val="num" w:pos="2160"/>
+        </w:tabs>
+        <w:ind w:left="2160" w:hanging="360"/>
+      </w:pPr>
+      <w:rPr>
+        <w:rFonts w:ascii="Wingdings" w:hAnsi="Wingdings" w:hint="default"/>
+        <w:sz w:val="20"/>
+      </w:rPr>
+    </w:lvl>
+    <w:lvl w:ilvl="3" w:tentative="1">
+      <w:start w:val="1"/>
+      <w:numFmt w:val="bullet"/>
+      <w:lvlText w:val=""/>
+      <w:lvlJc w:val="left"/>
+      <w:pPr>
+        <w:tabs>
+          <w:tab w:val="num" w:pos="2880"/>
+        </w:tabs>
+        <w:ind w:left="2880" w:hanging="360"/>
+      </w:pPr>
+      <w:rPr>
+        <w:rFonts w:ascii="Wingdings" w:hAnsi="Wingdings" w:hint="default"/>
+        <w:sz w:val="20"/>
+      </w:rPr>
+    </w:lvl>
+    <w:lvl w:ilvl="4" w:tentative="1">
+      <w:start w:val="1"/>
+      <w:numFmt w:val="bullet"/>
+      <w:lvlText w:val=""/>
+      <w:lvlJc w:val="left"/>
+      <w:pPr>
+        <w:tabs>
+          <w:tab w:val="num" w:pos="3600"/>
+        </w:tabs>
+        <w:ind w:left="3600" w:hanging="360"/>
+      </w:pPr>
+      <w:rPr>
+        <w:rFonts w:ascii="Wingdings" w:hAnsi="Wingdings" w:hint="default"/>
+        <w:sz w:val="20"/>
+      </w:rPr>
+    </w:lvl>
+    <w:lvl w:ilvl="5" w:tentative="1">
+      <w:start w:val="1"/>
+      <w:numFmt w:val="bullet"/>
+      <w:lvlText w:val=""/>
+      <w:lvlJc w:val="left"/>
+      <w:pPr>
+        <w:tabs>
+          <w:tab w:val="num" w:pos="4320"/>
+        </w:tabs>
+        <w:ind w:left="4320" w:hanging="360"/>
+      </w:pPr>
+      <w:rPr>
+        <w:rFonts w:ascii="Wingdings" w:hAnsi="Wingdings" w:hint="default"/>
+        <w:sz w:val="20"/>
+      </w:rPr>
+    </w:lvl>
+    <w:lvl w:ilvl="6" w:tentative="1">
+      <w:start w:val="1"/>
+      <w:numFmt w:val="bullet"/>
+      <w:lvlText w:val=""/>
+      <w:lvlJc w:val="left"/>
+      <w:pPr>
+        <w:tabs>
+          <w:tab w:val="num" w:pos="5040"/>
+        </w:tabs>
+        <w:ind w:left="5040" w:hanging="360"/>
+      </w:pPr>
+      <w:rPr>
+        <w:rFonts w:ascii="Wingdings" w:hAnsi="Wingdings" w:hint="default"/>
+        <w:sz w:val="20"/>
+      </w:rPr>
+    </w:lvl>
+    <w:lvl w:ilvl="7" w:tentative="1">
+      <w:start w:val="1"/>
+      <w:numFmt w:val="bullet"/>
+      <w:lvlText w:val=""/>
+      <w:lvlJc w:val="left"/>
+      <w:pPr>
+        <w:tabs>
+          <w:tab w:val="num" w:pos="5760"/>
+        </w:tabs>
+        <w:ind w:left="5760" w:hanging="360"/>
+      </w:pPr>
+      <w:rPr>
+        <w:rFonts w:ascii="Wingdings" w:hAnsi="Wingdings" w:hint="default"/>
+        <w:sz w:val="20"/>
+      </w:rPr>
+    </w:lvl>
+    <w:lvl w:ilvl="8" w:tentative="1">
+      <w:start w:val="1"/>
+      <w:numFmt w:val="bullet"/>
+      <w:lvlText w:val=""/>
+      <w:lvlJc w:val="left"/>
+      <w:pPr>
+        <w:tabs>
+          <w:tab w:val="num" w:pos="6480"/>
+        </w:tabs>
+        <w:ind w:left="6480" w:hanging="360"/>
+      </w:pPr>
+      <w:rPr>
+        <w:rFonts w:ascii="Wingdings" w:hAnsi="Wingdings" w:hint="default"/>
+        <w:sz w:val="20"/>
+      </w:rPr>
+    </w:lvl>
+  </w:abstractNum>
+  <w:abstractNum w:abstractNumId="4" w15:restartNumberingAfterBreak="0">
     <w:nsid w:val="23DA2CDE"/>
     <w:multiLevelType w:val="multilevel"/>
     <w:tmpl w:val="ECFC4934"/>
@@ -1841,7 +2779,7 @@
       </w:rPr>
     </w:lvl>
   </w:abstractNum>
-  <w:abstractNum w:abstractNumId="3" w15:restartNumberingAfterBreak="0">
+  <w:abstractNum w:abstractNumId="5" w15:restartNumberingAfterBreak="0">
     <w:nsid w:val="245A422A"/>
     <w:multiLevelType w:val="multilevel"/>
     <w:tmpl w:val="342E43F0"/>
@@ -1990,7 +2928,156 @@
       </w:rPr>
     </w:lvl>
   </w:abstractNum>
-  <w:abstractNum w:abstractNumId="4" w15:restartNumberingAfterBreak="0">
+  <w:abstractNum w:abstractNumId="6" w15:restartNumberingAfterBreak="0">
+    <w:nsid w:val="2E677301"/>
+    <w:multiLevelType w:val="multilevel"/>
+    <w:tmpl w:val="596259B6"/>
+    <w:lvl w:ilvl="0">
+      <w:start w:val="1"/>
+      <w:numFmt w:val="bullet"/>
+      <w:lvlText w:val=""/>
+      <w:lvlJc w:val="left"/>
+      <w:pPr>
+        <w:tabs>
+          <w:tab w:val="num" w:pos="720"/>
+        </w:tabs>
+        <w:ind w:left="720" w:hanging="360"/>
+      </w:pPr>
+      <w:rPr>
+        <w:rFonts w:ascii="Symbol" w:hAnsi="Symbol" w:hint="default"/>
+        <w:sz w:val="20"/>
+      </w:rPr>
+    </w:lvl>
+    <w:lvl w:ilvl="1" w:tentative="1">
+      <w:start w:val="1"/>
+      <w:numFmt w:val="bullet"/>
+      <w:lvlText w:val="o"/>
+      <w:lvlJc w:val="left"/>
+      <w:pPr>
+        <w:tabs>
+          <w:tab w:val="num" w:pos="1440"/>
+        </w:tabs>
+        <w:ind w:left="1440" w:hanging="360"/>
+      </w:pPr>
+      <w:rPr>
+        <w:rFonts w:ascii="Courier New" w:hAnsi="Courier New" w:hint="default"/>
+        <w:sz w:val="20"/>
+      </w:rPr>
+    </w:lvl>
+    <w:lvl w:ilvl="2" w:tentative="1">
+      <w:start w:val="1"/>
+      <w:numFmt w:val="bullet"/>
+      <w:lvlText w:val=""/>
+      <w:lvlJc w:val="left"/>
+      <w:pPr>
+        <w:tabs>
+          <w:tab w:val="num" w:pos="2160"/>
+        </w:tabs>
+        <w:ind w:left="2160" w:hanging="360"/>
+      </w:pPr>
+      <w:rPr>
+        <w:rFonts w:ascii="Wingdings" w:hAnsi="Wingdings" w:hint="default"/>
+        <w:sz w:val="20"/>
+      </w:rPr>
+    </w:lvl>
+    <w:lvl w:ilvl="3" w:tentative="1">
+      <w:start w:val="1"/>
+      <w:numFmt w:val="bullet"/>
+      <w:lvlText w:val=""/>
+      <w:lvlJc w:val="left"/>
+      <w:pPr>
+        <w:tabs>
+          <w:tab w:val="num" w:pos="2880"/>
+        </w:tabs>
+        <w:ind w:left="2880" w:hanging="360"/>
+      </w:pPr>
+      <w:rPr>
+        <w:rFonts w:ascii="Wingdings" w:hAnsi="Wingdings" w:hint="default"/>
+        <w:sz w:val="20"/>
+      </w:rPr>
+    </w:lvl>
+    <w:lvl w:ilvl="4" w:tentative="1">
+      <w:start w:val="1"/>
+      <w:numFmt w:val="bullet"/>
+      <w:lvlText w:val=""/>
+      <w:lvlJc w:val="left"/>
+      <w:pPr>
+        <w:tabs>
+          <w:tab w:val="num" w:pos="3600"/>
+        </w:tabs>
+        <w:ind w:left="3600" w:hanging="360"/>
+      </w:pPr>
+      <w:rPr>
+        <w:rFonts w:ascii="Wingdings" w:hAnsi="Wingdings" w:hint="default"/>
+        <w:sz w:val="20"/>
+      </w:rPr>
+    </w:lvl>
+    <w:lvl w:ilvl="5" w:tentative="1">
+      <w:start w:val="1"/>
+      <w:numFmt w:val="bullet"/>
+      <w:lvlText w:val=""/>
+      <w:lvlJc w:val="left"/>
+      <w:pPr>
+        <w:tabs>
+          <w:tab w:val="num" w:pos="4320"/>
+        </w:tabs>
+        <w:ind w:left="4320" w:hanging="360"/>
+      </w:pPr>
+      <w:rPr>
+        <w:rFonts w:ascii="Wingdings" w:hAnsi="Wingdings" w:hint="default"/>
+        <w:sz w:val="20"/>
+      </w:rPr>
+    </w:lvl>
+    <w:lvl w:ilvl="6" w:tentative="1">
+      <w:start w:val="1"/>
+      <w:numFmt w:val="bullet"/>
+      <w:lvlText w:val=""/>
+      <w:lvlJc w:val="left"/>
+      <w:pPr>
+        <w:tabs>
+          <w:tab w:val="num" w:pos="5040"/>
+        </w:tabs>
+        <w:ind w:left="5040" w:hanging="360"/>
+      </w:pPr>
+      <w:rPr>
+        <w:rFonts w:ascii="Wingdings" w:hAnsi="Wingdings" w:hint="default"/>
+        <w:sz w:val="20"/>
+      </w:rPr>
+    </w:lvl>
+    <w:lvl w:ilvl="7" w:tentative="1">
+      <w:start w:val="1"/>
+      <w:numFmt w:val="bullet"/>
+      <w:lvlText w:val=""/>
+      <w:lvlJc w:val="left"/>
+      <w:pPr>
+        <w:tabs>
+          <w:tab w:val="num" w:pos="5760"/>
+        </w:tabs>
+        <w:ind w:left="5760" w:hanging="360"/>
+      </w:pPr>
+      <w:rPr>
+        <w:rFonts w:ascii="Wingdings" w:hAnsi="Wingdings" w:hint="default"/>
+        <w:sz w:val="20"/>
+      </w:rPr>
+    </w:lvl>
+    <w:lvl w:ilvl="8" w:tentative="1">
+      <w:start w:val="1"/>
+      <w:numFmt w:val="bullet"/>
+      <w:lvlText w:val=""/>
+      <w:lvlJc w:val="left"/>
+      <w:pPr>
+        <w:tabs>
+          <w:tab w:val="num" w:pos="6480"/>
+        </w:tabs>
+        <w:ind w:left="6480" w:hanging="360"/>
+      </w:pPr>
+      <w:rPr>
+        <w:rFonts w:ascii="Wingdings" w:hAnsi="Wingdings" w:hint="default"/>
+        <w:sz w:val="20"/>
+      </w:rPr>
+    </w:lvl>
+  </w:abstractNum>
+  <w:abstractNum w:abstractNumId="7" w15:restartNumberingAfterBreak="0">
     <w:nsid w:val="37B01085"/>
     <w:multiLevelType w:val="multilevel"/>
     <w:tmpl w:val="DAF8FB7C"/>
@@ -2103,7 +3190,7 @@
       </w:pPr>
     </w:lvl>
   </w:abstractNum>
-  <w:abstractNum w:abstractNumId="5" w15:restartNumberingAfterBreak="0">
+  <w:abstractNum w:abstractNumId="8" w15:restartNumberingAfterBreak="0">
     <w:nsid w:val="4DF022EB"/>
     <w:multiLevelType w:val="multilevel"/>
     <w:tmpl w:val="B0380A12"/>
@@ -2252,7 +3339,7 @@
       </w:rPr>
     </w:lvl>
   </w:abstractNum>
-  <w:abstractNum w:abstractNumId="6" w15:restartNumberingAfterBreak="0">
+  <w:abstractNum w:abstractNumId="9" w15:restartNumberingAfterBreak="0">
     <w:nsid w:val="62BE53DF"/>
     <w:multiLevelType w:val="multilevel"/>
     <w:tmpl w:val="93D86B7A"/>
@@ -2365,7 +3452,7 @@
       </w:pPr>
     </w:lvl>
   </w:abstractNum>
-  <w:abstractNum w:abstractNumId="7" w15:restartNumberingAfterBreak="0">
+  <w:abstractNum w:abstractNumId="10" w15:restartNumberingAfterBreak="0">
     <w:nsid w:val="67934CDB"/>
     <w:multiLevelType w:val="multilevel"/>
     <w:tmpl w:val="4A7C08CC"/>
@@ -2479,28 +3566,37 @@
     </w:lvl>
   </w:abstractNum>
   <w:num w:numId="1" w16cid:durableId="1482232158">
-    <w:abstractNumId w:val="0"/>
+    <w:abstractNumId w:val="1"/>
   </w:num>
   <w:num w:numId="2" w16cid:durableId="1562131473">
+    <w:abstractNumId w:val="10"/>
+  </w:num>
+  <w:num w:numId="3" w16cid:durableId="355158506">
+    <w:abstractNumId w:val="2"/>
+  </w:num>
+  <w:num w:numId="4" w16cid:durableId="1700468697">
+    <w:abstractNumId w:val="8"/>
+  </w:num>
+  <w:num w:numId="5" w16cid:durableId="1068116574">
+    <w:abstractNumId w:val="9"/>
+  </w:num>
+  <w:num w:numId="6" w16cid:durableId="1729954953">
+    <w:abstractNumId w:val="4"/>
+  </w:num>
+  <w:num w:numId="7" w16cid:durableId="1518422432">
+    <w:abstractNumId w:val="5"/>
+  </w:num>
+  <w:num w:numId="8" w16cid:durableId="670643691">
     <w:abstractNumId w:val="7"/>
   </w:num>
-  <w:num w:numId="3" w16cid:durableId="355158506">
-    <w:abstractNumId w:val="1"/>
+  <w:num w:numId="9" w16cid:durableId="1555701889">
+    <w:abstractNumId w:val="3"/>
   </w:num>
-  <w:num w:numId="4" w16cid:durableId="1700468697">
-    <w:abstractNumId w:val="5"/>
-  </w:num>
-  <w:num w:numId="5" w16cid:durableId="1068116574">
+  <w:num w:numId="10" w16cid:durableId="474420124">
     <w:abstractNumId w:val="6"/>
   </w:num>
-  <w:num w:numId="6" w16cid:durableId="1729954953">
-    <w:abstractNumId w:val="2"/>
-  </w:num>
-  <w:num w:numId="7" w16cid:durableId="1518422432">
-    <w:abstractNumId w:val="3"/>
-  </w:num>
-  <w:num w:numId="8" w16cid:durableId="670643691">
-    <w:abstractNumId w:val="4"/>
+  <w:num w:numId="11" w16cid:durableId="1584338889">
+    <w:abstractNumId w:val="0"/>
   </w:num>
 </w:numbering>
 </file>

</xml_diff>